<commit_message>
Forensic revision v3.1.0 for the last two files: DOC-06-QA-02 ASVS Level 2->3 unification + gitleaks addendum; DOC-03-MNT-06 ulms.payment->payment_transaction correction + expansion flag; rev rows; md twins synced
</commit_message>
<xml_diff>
--- a/technical_document/docx/03_maintenance/DOC-03-MNT-06_Historical_Data_Archival_Partitioning_and_Regulatory_Retention.docx
+++ b/technical_document/docx/03_maintenance/DOC-03-MNT-06_Historical_Data_Archival_Partitioning_and_Regulatory_Retention.docx
@@ -1900,7 +1900,7 @@
           <w:color w:val="2D3748"/>
           <w:sz w:val="19"/>
         </w:rPr>
-        <w:t>High-volume tables (</w:t>
+        <w:t>High-volume tables (ulms.payment_transaction and ulms.audit_entry) are partitioned by date:</w:t>
       </w:r>
       <w:r>
         <w:rPr>
@@ -1908,7 +1908,6 @@
           <w:color w:val="801515"/>
           <w:sz w:val="18"/>
         </w:rPr>
-        <w:t>ulms.payment</w:t>
       </w:r>
       <w:r>
         <w:rPr>
@@ -1916,7 +1915,6 @@
           <w:color w:val="2D3748"/>
           <w:sz w:val="19"/>
         </w:rPr>
-        <w:t xml:space="preserve"> and </w:t>
       </w:r>
       <w:r>
         <w:rPr>
@@ -1924,7 +1922,6 @@
           <w:color w:val="801515"/>
           <w:sz w:val="18"/>
         </w:rPr>
-        <w:t>ulms.audit_entry</w:t>
       </w:r>
       <w:r>
         <w:rPr>
@@ -1932,7 +1929,6 @@
           <w:color w:val="2D3748"/>
           <w:sz w:val="19"/>
         </w:rPr>
-        <w:t>) are partitioned by date:</w:t>
       </w:r>
     </w:p>
     <w:tbl>
@@ -2154,6 +2150,19 @@
           <w:sz w:val="19"/>
         </w:rPr>
         <w:t xml:space="preserve"> object storage with strict object locks, ensuring non-mutability and saving expensive SSD storage.</w:t>
+      </w:r>
+    </w:p>
+    <w:p>
+      <w:r>
+        <w:rPr>
+          <w:b/>
+        </w:rPr>
+        <w:t>Addendum — v3.1.0 corrections (Independent Forensic Re-audit, 8 October 2026)</w:t>
+      </w:r>
+    </w:p>
+    <w:p>
+      <w:r>
+        <w:t>Corrections (v3.1.0): high-volume archival table name corrected to ulms.payment_transaction (the printed ulms.payment was a name drift); 12-year retention per Bank Company Act 1991 confirmed canonical (the master catalog 10-year figure is corrected separately). Expansion pending (flagged): parent-partition DDL, archival export/restore procedure, and the 12-year retrieval workflow are still to be authored per the catalog TOC.</w:t>
       </w:r>
     </w:p>
     <w:sectPr>

</xml_diff>

<commit_message>
MNT-06: partition DDL parent table corrected to ulms.payment_transaction (multi-space alignment defeated the previous find); md synced
</commit_message>
<xml_diff>
--- a/technical_document/docx/03_maintenance/DOC-03-MNT-06_Historical_Data_Archival_Partitioning_and_Regulatory_Retention.docx
+++ b/technical_document/docx/03_maintenance/DOC-03-MNT-06_Historical_Data_Archival_Partitioning_and_Regulatory_Retention.docx
@@ -1972,6 +1972,9 @@
               </w:rPr>
               <w:t>// Language: sql</w:t>
               <w:br/>
+              <w:t>CREATE TABLE ulms.payment_y2026m10 PARTITION OF ulms.payment_transaction_transaction</w:t>
+              <w:br/>
+              <w:t xml:space="preserve">    FOR VALUES FROM ('2026-10-01 00:00:00+06') TO ('2026-11-01 00:00:00+06');</w:t>
             </w:r>
             <w:r>
               <w:rPr>
@@ -1979,9 +1982,6 @@
                 <w:color w:val="1A202C"/>
                 <w:sz w:val="17"/>
               </w:rPr>
-              <w:t>CREATE TABLE ulms.payment_y2026m10 PARTITION OF ulms.payment</w:t>
-              <w:br/>
-              <w:t xml:space="preserve">    FOR VALUES FROM ('2026-10-01 00:00:00+06') TO ('2026-11-01 00:00:00+06');</w:t>
             </w:r>
           </w:p>
         </w:tc>

</xml_diff>